<commit_message>
Validate complete renv environment lock
</commit_message>
<xml_diff>
--- a/PLOS_data_availability_statement.docx
+++ b/PLOS_data_availability_statement.docx
@@ -62,7 +62,7 @@
     </w:p>
     <w:p>
       <w:r>
-        <w:t>The author-generated analysis code, metadata files, preprocessing records, module definitions, statistical analysis scripts, locked result tables, and figure-generation workflows are prepared for deposit at the owner-supplied target: https://github.com/shice951229-oss/cross-tissue-module-reproducibility.</w:t>
+        <w:t>The author-generated analysis code, metadata files, preprocessing records, module definitions, statistical analysis scripts, locked result tables, and figure-generation workflows are maintained in the owner-confirmed private repository at https://github.com/shice951229-oss/cross-tissue-module-reproducibility.</w:t>
       </w:r>
     </w:p>
     <w:p>
@@ -77,7 +77,7 @@
           <w:color w:val="9B1C1C"/>
           <w:sz w:val="22"/>
         </w:rPr>
-        <w:t>As of 2 August 2026, this target has not been independently verified as publicly accessible, and no immutable code tag or formal release has been issued. This draft must not be used to claim public code availability until access and the release tag are verified.</w:t>
+        <w:t>As of 3 August 2026, the repository owner reports that the initial commit has been pushed, but the repository is not claimed to be publicly accessible and no immutable code tag or formal release has been issued. This draft must not be used to claim public code availability until access and the release tag are verified.</w:t>
       </w:r>
     </w:p>
     <w:p>

</xml_diff>

<commit_message>
Synchronize public release and DOI metadata
</commit_message>
<xml_diff>
--- a/PLOS_data_availability_statement.docx
+++ b/PLOS_data_availability_statement.docx
@@ -44,7 +44,7 @@
           <w:color w:val="4B5563"/>
           <w:sz w:val="26"/>
         </w:rPr>
-        <w:t>Draft wording pending verified release identifiers</w:t>
+        <w:t>Verified public repository and archived release identifiers</w:t>
       </w:r>
     </w:p>
     <w:p>
@@ -62,7 +62,7 @@
     </w:p>
     <w:p>
       <w:r>
-        <w:t>The author-generated analysis code, metadata files, preprocessing records, module definitions, statistical analysis scripts, locked result tables, and figure-generation workflows are maintained in the owner-confirmed private repository at https://github.com/shice951229-oss/cross-tissue-module-reproducibility.</w:t>
+        <w:t>The author-generated analysis code, metadata files, preprocessing records, module definitions, statistical analysis scripts, locked result tables, and figure-generation workflows are publicly available at https://github.com/shice951229-oss/cross-tissue-module-reproducibility.</w:t>
       </w:r>
     </w:p>
     <w:p>
@@ -77,12 +77,12 @@
           <w:color w:val="9B1C1C"/>
           <w:sz w:val="22"/>
         </w:rPr>
-        <w:t>As of 3 August 2026, the repository owner reports that the initial commit has been pushed, but the repository is not claimed to be publicly accessible and no immutable code tag or formal release has been issued. This draft must not be used to claim public code availability until access and the release tag are verified.</w:t>
+        <w:t>The public v1.0.0 GitHub release archives validated commit 3eb6474. Public release authorization and use of the MIT License were confirmed before publication.</w:t>
       </w:r>
     </w:p>
     <w:p>
       <w:r>
-        <w:t>No Zenodo archive DOI has been issued. The final submission statement must be synchronized only after the verified GitHub release has been archived and a real DOI is available.</w:t>
+        <w:t>The archived v1.0.0 release is available on Zenodo at https://doi.org/10.5281/zenodo.21762839. The concept DOI for all repository versions is https://doi.org/10.5281/zenodo.21762838.</w:t>
       </w:r>
     </w:p>
     <w:sectPr>

</xml_diff>